<commit_message>
refactored docx templates and generating
</commit_message>
<xml_diff>
--- a/backend/storage/templates/test_contract.docx
+++ b/backend/storage/templates/test_contract.docx
@@ -4,15 +4,675 @@
   <w:body>
     <w:p>
       <w:pPr>
-        <w:rPr>
-          <w:rFonts w:hint="default"/>
-        </w:rPr>
+        <w:spacing w:after="200"/>
+        <w:jc w:val="center"/>
       </w:pPr>
       <w:r>
         <w:rPr>
-          <w:rFonts w:hint="default"/>
+          <w:rFonts w:ascii="Times New Roman" w:hAnsi="Times New Roman" w:eastAsia="Times New Roman"/>
+          <w:b/>
+          <w:sz w:val="28"/>
+        </w:rPr>
+        <w:t>ТЕСТОВЫЙ ШАБЛОН ДОГОВОРА</w:t>
+      </w:r>
+    </w:p>
+    <w:p>
+      <w:pPr>
+        <w:spacing w:after="160"/>
+        <w:jc w:val="center"/>
+      </w:pPr>
+      <w:r>
+        <w:rPr>
+          <w:rFonts w:ascii="Times New Roman" w:hAnsi="Times New Roman" w:eastAsia="Times New Roman"/>
+          <w:b/>
+          <w:sz w:val="26"/>
         </w:rPr>
         <w:t>ДОГОВОР №{{contract_number}}</w:t>
+      </w:r>
+    </w:p>
+    <w:p>
+      <w:pPr>
+        <w:spacing w:after="240"/>
+        <w:jc w:val="center"/>
+      </w:pPr>
+      <w:r>
+        <w:rPr>
+          <w:rFonts w:ascii="Times New Roman" w:hAnsi="Times New Roman" w:eastAsia="Times New Roman"/>
+          <w:b w:val="0"/>
+          <w:sz w:val="24"/>
+        </w:rPr>
+        <w:t>Дата: {{contract_date_text}}</w:t>
+      </w:r>
+    </w:p>
+    <w:tbl>
+      <w:tblPr>
+        <w:tblStyle w:val="4"/>
+        <w:tblW w:w="0" w:type="auto"/>
+        <w:jc w:val="center"/>
+        <w:tblBorders>
+          <w:top w:val="single" w:color="auto" w:sz="4" w:space="0"/>
+          <w:left w:val="single" w:color="auto" w:sz="4" w:space="0"/>
+          <w:bottom w:val="single" w:color="auto" w:sz="4" w:space="0"/>
+          <w:right w:val="single" w:color="auto" w:sz="4" w:space="0"/>
+          <w:insideH w:val="single" w:color="auto" w:sz="4" w:space="0"/>
+          <w:insideV w:val="single" w:color="auto" w:sz="4" w:space="0"/>
+        </w:tblBorders>
+        <w:tblLayout w:type="autofit"/>
+        <w:tblCellMar>
+          <w:top w:w="0" w:type="dxa"/>
+          <w:left w:w="108" w:type="dxa"/>
+          <w:bottom w:w="0" w:type="dxa"/>
+          <w:right w:w="108" w:type="dxa"/>
+        </w:tblCellMar>
+      </w:tblPr>
+      <w:tblGrid>
+        <w:gridCol w:w="2268"/>
+        <w:gridCol w:w="6804"/>
+      </w:tblGrid>
+      <w:tr>
+        <w:tblPrEx>
+          <w:tblBorders>
+            <w:top w:val="single" w:color="auto" w:sz="4" w:space="0"/>
+            <w:left w:val="single" w:color="auto" w:sz="4" w:space="0"/>
+            <w:bottom w:val="single" w:color="auto" w:sz="4" w:space="0"/>
+            <w:right w:val="single" w:color="auto" w:sz="4" w:space="0"/>
+            <w:insideH w:val="single" w:color="auto" w:sz="4" w:space="0"/>
+            <w:insideV w:val="single" w:color="auto" w:sz="4" w:space="0"/>
+          </w:tblBorders>
+          <w:tblCellMar>
+            <w:top w:w="0" w:type="dxa"/>
+            <w:left w:w="108" w:type="dxa"/>
+            <w:bottom w:w="0" w:type="dxa"/>
+            <w:right w:w="108" w:type="dxa"/>
+          </w:tblCellMar>
+        </w:tblPrEx>
+        <w:trPr>
+          <w:jc w:val="center"/>
+        </w:trPr>
+        <w:tc>
+          <w:tcPr>
+            <w:tcW w:w="2268" w:type="dxa"/>
+            <w:vAlign w:val="center"/>
+          </w:tcPr>
+          <w:p>
+            <w:pPr>
+              <w:spacing w:after="0" w:line="240" w:lineRule="auto"/>
+            </w:pPr>
+            <w:r>
+              <w:rPr>
+                <w:rFonts w:ascii="Times New Roman" w:hAnsi="Times New Roman" w:eastAsia="Times New Roman"/>
+                <w:sz w:val="22"/>
+              </w:rPr>
+              <w:t>Заказчик</w:t>
+            </w:r>
+          </w:p>
+        </w:tc>
+        <w:tc>
+          <w:tcPr>
+            <w:tcW w:w="6804" w:type="dxa"/>
+            <w:vAlign w:val="center"/>
+          </w:tcPr>
+          <w:p>
+            <w:pPr>
+              <w:spacing w:after="0" w:line="240" w:lineRule="auto"/>
+            </w:pPr>
+            <w:r>
+              <w:rPr>
+                <w:rFonts w:ascii="Times New Roman" w:hAnsi="Times New Roman" w:eastAsia="Times New Roman"/>
+                <w:sz w:val="22"/>
+              </w:rPr>
+              <w:t>{{client_name}}</w:t>
+            </w:r>
+          </w:p>
+        </w:tc>
+      </w:tr>
+      <w:tr>
+        <w:tblPrEx>
+          <w:tblBorders>
+            <w:top w:val="single" w:color="auto" w:sz="4" w:space="0"/>
+            <w:left w:val="single" w:color="auto" w:sz="4" w:space="0"/>
+            <w:bottom w:val="single" w:color="auto" w:sz="4" w:space="0"/>
+            <w:right w:val="single" w:color="auto" w:sz="4" w:space="0"/>
+            <w:insideH w:val="single" w:color="auto" w:sz="4" w:space="0"/>
+            <w:insideV w:val="single" w:color="auto" w:sz="4" w:space="0"/>
+          </w:tblBorders>
+          <w:tblCellMar>
+            <w:top w:w="0" w:type="dxa"/>
+            <w:left w:w="108" w:type="dxa"/>
+            <w:bottom w:w="0" w:type="dxa"/>
+            <w:right w:w="108" w:type="dxa"/>
+          </w:tblCellMar>
+        </w:tblPrEx>
+        <w:trPr>
+          <w:jc w:val="center"/>
+        </w:trPr>
+        <w:tc>
+          <w:tcPr>
+            <w:tcW w:w="2268" w:type="dxa"/>
+            <w:vAlign w:val="center"/>
+          </w:tcPr>
+          <w:p>
+            <w:pPr>
+              <w:spacing w:after="0" w:line="240" w:lineRule="auto"/>
+            </w:pPr>
+            <w:r>
+              <w:rPr>
+                <w:rFonts w:ascii="Times New Roman" w:hAnsi="Times New Roman" w:eastAsia="Times New Roman"/>
+                <w:sz w:val="22"/>
+              </w:rPr>
+              <w:t>Сумма</w:t>
+            </w:r>
+          </w:p>
+        </w:tc>
+        <w:tc>
+          <w:tcPr>
+            <w:tcW w:w="6804" w:type="dxa"/>
+            <w:vAlign w:val="center"/>
+          </w:tcPr>
+          <w:p>
+            <w:pPr>
+              <w:spacing w:after="0" w:line="240" w:lineRule="auto"/>
+            </w:pPr>
+            <w:r>
+              <w:rPr>
+                <w:rFonts w:ascii="Times New Roman" w:hAnsi="Times New Roman" w:eastAsia="Times New Roman"/>
+                <w:sz w:val="22"/>
+              </w:rPr>
+              <w:t>{{amount_number}} рублей</w:t>
+            </w:r>
+          </w:p>
+        </w:tc>
+      </w:tr>
+      <w:tr>
+        <w:tblPrEx>
+          <w:tblBorders>
+            <w:top w:val="single" w:color="auto" w:sz="4" w:space="0"/>
+            <w:left w:val="single" w:color="auto" w:sz="4" w:space="0"/>
+            <w:bottom w:val="single" w:color="auto" w:sz="4" w:space="0"/>
+            <w:right w:val="single" w:color="auto" w:sz="4" w:space="0"/>
+            <w:insideH w:val="single" w:color="auto" w:sz="4" w:space="0"/>
+            <w:insideV w:val="single" w:color="auto" w:sz="4" w:space="0"/>
+          </w:tblBorders>
+          <w:tblCellMar>
+            <w:top w:w="0" w:type="dxa"/>
+            <w:left w:w="108" w:type="dxa"/>
+            <w:bottom w:w="0" w:type="dxa"/>
+            <w:right w:w="108" w:type="dxa"/>
+          </w:tblCellMar>
+        </w:tblPrEx>
+        <w:trPr>
+          <w:jc w:val="center"/>
+        </w:trPr>
+        <w:tc>
+          <w:tcPr>
+            <w:tcW w:w="2268" w:type="dxa"/>
+            <w:vAlign w:val="center"/>
+          </w:tcPr>
+          <w:p>
+            <w:pPr>
+              <w:spacing w:after="0" w:line="240" w:lineRule="auto"/>
+            </w:pPr>
+            <w:r>
+              <w:rPr>
+                <w:rFonts w:ascii="Times New Roman" w:hAnsi="Times New Roman" w:eastAsia="Times New Roman"/>
+                <w:sz w:val="22"/>
+              </w:rPr>
+              <w:t>Предоплата</w:t>
+            </w:r>
+          </w:p>
+        </w:tc>
+        <w:tc>
+          <w:tcPr>
+            <w:tcW w:w="6804" w:type="dxa"/>
+            <w:vAlign w:val="center"/>
+          </w:tcPr>
+          <w:p>
+            <w:pPr>
+              <w:spacing w:after="0" w:line="240" w:lineRule="auto"/>
+            </w:pPr>
+            <w:r>
+              <w:rPr>
+                <w:rFonts w:ascii="Times New Roman" w:hAnsi="Times New Roman" w:eastAsia="Times New Roman"/>
+                <w:sz w:val="22"/>
+              </w:rPr>
+              <w:t>{{prepayment_amount}} рублей</w:t>
+            </w:r>
+          </w:p>
+        </w:tc>
+      </w:tr>
+      <w:tr>
+        <w:tblPrEx>
+          <w:tblBorders>
+            <w:top w:val="single" w:color="auto" w:sz="4" w:space="0"/>
+            <w:left w:val="single" w:color="auto" w:sz="4" w:space="0"/>
+            <w:bottom w:val="single" w:color="auto" w:sz="4" w:space="0"/>
+            <w:right w:val="single" w:color="auto" w:sz="4" w:space="0"/>
+            <w:insideH w:val="single" w:color="auto" w:sz="4" w:space="0"/>
+            <w:insideV w:val="single" w:color="auto" w:sz="4" w:space="0"/>
+          </w:tblBorders>
+          <w:tblCellMar>
+            <w:top w:w="0" w:type="dxa"/>
+            <w:left w:w="108" w:type="dxa"/>
+            <w:bottom w:w="0" w:type="dxa"/>
+            <w:right w:w="108" w:type="dxa"/>
+          </w:tblCellMar>
+        </w:tblPrEx>
+        <w:trPr>
+          <w:jc w:val="center"/>
+        </w:trPr>
+        <w:tc>
+          <w:tcPr>
+            <w:tcW w:w="2268" w:type="dxa"/>
+            <w:vAlign w:val="center"/>
+          </w:tcPr>
+          <w:p>
+            <w:pPr>
+              <w:spacing w:after="0" w:line="240" w:lineRule="auto"/>
+            </w:pPr>
+            <w:r>
+              <w:rPr>
+                <w:rFonts w:ascii="Times New Roman" w:hAnsi="Times New Roman" w:eastAsia="Times New Roman"/>
+                <w:sz w:val="22"/>
+              </w:rPr>
+              <w:t>Постоплата</w:t>
+            </w:r>
+          </w:p>
+        </w:tc>
+        <w:tc>
+          <w:tcPr>
+            <w:tcW w:w="6804" w:type="dxa"/>
+            <w:vAlign w:val="center"/>
+          </w:tcPr>
+          <w:p>
+            <w:pPr>
+              <w:spacing w:after="0" w:line="240" w:lineRule="auto"/>
+            </w:pPr>
+            <w:r>
+              <w:rPr>
+                <w:rFonts w:ascii="Times New Roman" w:hAnsi="Times New Roman" w:eastAsia="Times New Roman"/>
+                <w:sz w:val="22"/>
+              </w:rPr>
+              <w:t>{{postpayment_amount}} рублей</w:t>
+            </w:r>
+          </w:p>
+        </w:tc>
+      </w:tr>
+    </w:tbl>
+    <w:p>
+      <w:pPr>
+        <w:spacing w:after="80"/>
+      </w:pPr>
+    </w:p>
+    <w:p>
+      <w:pPr>
+        <w:spacing w:after="160"/>
+        <w:jc w:val="center"/>
+      </w:pPr>
+      <w:r>
+        <w:rPr>
+          <w:rFonts w:ascii="Times New Roman" w:hAnsi="Times New Roman" w:eastAsia="Times New Roman"/>
+          <w:b/>
+          <w:sz w:val="26"/>
+        </w:rPr>
+        <w:t>Работы по смете</w:t>
+      </w:r>
+    </w:p>
+    <w:tbl>
+      <w:tblPr>
+        <w:tblStyle w:val="4"/>
+        <w:tblW w:w="0" w:type="auto"/>
+        <w:jc w:val="center"/>
+        <w:tblBorders>
+          <w:top w:val="single" w:color="auto" w:sz="4" w:space="0"/>
+          <w:left w:val="single" w:color="auto" w:sz="4" w:space="0"/>
+          <w:bottom w:val="single" w:color="auto" w:sz="4" w:space="0"/>
+          <w:right w:val="single" w:color="auto" w:sz="4" w:space="0"/>
+          <w:insideH w:val="single" w:color="auto" w:sz="4" w:space="0"/>
+          <w:insideV w:val="single" w:color="auto" w:sz="4" w:space="0"/>
+        </w:tblBorders>
+        <w:tblLayout w:type="autofit"/>
+        <w:tblCellMar>
+          <w:top w:w="0" w:type="dxa"/>
+          <w:left w:w="108" w:type="dxa"/>
+          <w:bottom w:w="0" w:type="dxa"/>
+          <w:right w:w="108" w:type="dxa"/>
+        </w:tblCellMar>
+      </w:tblPr>
+      <w:tblGrid>
+        <w:gridCol w:w="3041"/>
+        <w:gridCol w:w="3984"/>
+        <w:gridCol w:w="3163"/>
+      </w:tblGrid>
+      <w:tr>
+        <w:tblPrEx>
+          <w:tblBorders>
+            <w:top w:val="single" w:color="auto" w:sz="4" w:space="0"/>
+            <w:left w:val="single" w:color="auto" w:sz="4" w:space="0"/>
+            <w:bottom w:val="single" w:color="auto" w:sz="4" w:space="0"/>
+            <w:right w:val="single" w:color="auto" w:sz="4" w:space="0"/>
+            <w:insideH w:val="single" w:color="auto" w:sz="4" w:space="0"/>
+            <w:insideV w:val="single" w:color="auto" w:sz="4" w:space="0"/>
+          </w:tblBorders>
+          <w:tblCellMar>
+            <w:top w:w="0" w:type="dxa"/>
+            <w:left w:w="108" w:type="dxa"/>
+            <w:bottom w:w="0" w:type="dxa"/>
+            <w:right w:w="108" w:type="dxa"/>
+          </w:tblCellMar>
+        </w:tblPrEx>
+        <w:trPr>
+          <w:tblHeader/>
+          <w:jc w:val="center"/>
+        </w:trPr>
+        <w:tc>
+          <w:tcPr>
+            <w:tcW w:w="737" w:type="dxa"/>
+            <w:shd w:val="clear" w:color="auto" w:fill="D9EAF7"/>
+            <w:vAlign w:val="center"/>
+          </w:tcPr>
+          <w:p>
+            <w:pPr>
+              <w:spacing w:after="0" w:line="240" w:lineRule="auto"/>
+              <w:jc w:val="center"/>
+            </w:pPr>
+            <w:r>
+              <w:rPr>
+                <w:rFonts w:ascii="Times New Roman" w:hAnsi="Times New Roman" w:eastAsia="Times New Roman"/>
+                <w:sz w:val="22"/>
+              </w:rPr>
+              <w:t>№</w:t>
+            </w:r>
+          </w:p>
+        </w:tc>
+        <w:tc>
+          <w:tcPr>
+            <w:tcW w:w="6917" w:type="dxa"/>
+            <w:shd w:val="clear" w:color="auto" w:fill="D9EAF7"/>
+            <w:vAlign w:val="center"/>
+          </w:tcPr>
+          <w:p>
+            <w:pPr>
+              <w:spacing w:after="0" w:line="240" w:lineRule="auto"/>
+              <w:jc w:val="center"/>
+            </w:pPr>
+            <w:r>
+              <w:rPr>
+                <w:rFonts w:ascii="Times New Roman" w:hAnsi="Times New Roman" w:eastAsia="Times New Roman"/>
+                <w:sz w:val="22"/>
+              </w:rPr>
+              <w:t>Наименование работы</w:t>
+            </w:r>
+          </w:p>
+        </w:tc>
+        <w:tc>
+          <w:tcPr>
+            <w:tcW w:w="1984" w:type="dxa"/>
+            <w:shd w:val="clear" w:color="auto" w:fill="D9EAF7"/>
+            <w:vAlign w:val="center"/>
+          </w:tcPr>
+          <w:p>
+            <w:pPr>
+              <w:spacing w:after="0" w:line="240" w:lineRule="auto"/>
+              <w:jc w:val="center"/>
+            </w:pPr>
+            <w:r>
+              <w:rPr>
+                <w:rFonts w:ascii="Times New Roman" w:hAnsi="Times New Roman" w:eastAsia="Times New Roman"/>
+                <w:sz w:val="22"/>
+              </w:rPr>
+              <w:t>Стоимость, руб.</w:t>
+            </w:r>
+          </w:p>
+        </w:tc>
+      </w:tr>
+      <w:tr>
+        <w:tblPrEx>
+          <w:tblBorders>
+            <w:top w:val="single" w:color="auto" w:sz="4" w:space="0"/>
+            <w:left w:val="single" w:color="auto" w:sz="4" w:space="0"/>
+            <w:bottom w:val="single" w:color="auto" w:sz="4" w:space="0"/>
+            <w:right w:val="single" w:color="auto" w:sz="4" w:space="0"/>
+            <w:insideH w:val="single" w:color="auto" w:sz="4" w:space="0"/>
+            <w:insideV w:val="single" w:color="auto" w:sz="4" w:space="0"/>
+          </w:tblBorders>
+          <w:tblCellMar>
+            <w:top w:w="0" w:type="dxa"/>
+            <w:left w:w="108" w:type="dxa"/>
+            <w:bottom w:w="0" w:type="dxa"/>
+            <w:right w:w="108" w:type="dxa"/>
+          </w:tblCellMar>
+        </w:tblPrEx>
+        <w:trPr>
+          <w:jc w:val="center"/>
+        </w:trPr>
+        <w:tc>
+          <w:tcPr>
+            <w:tcW w:w="737" w:type="dxa"/>
+            <w:vAlign w:val="center"/>
+          </w:tcPr>
+          <w:p>
+            <w:pPr>
+              <w:spacing w:after="0" w:line="240" w:lineRule="auto"/>
+              <w:jc w:val="center"/>
+            </w:pPr>
+            <w:r>
+              <w:rPr>
+                <w:rFonts w:ascii="Times New Roman" w:hAnsi="Times New Roman" w:eastAsia="Times New Roman"/>
+                <w:sz w:val="22"/>
+              </w:rPr>
+              <w:t>{{#estimate_works}}{{index}}</w:t>
+            </w:r>
+          </w:p>
+        </w:tc>
+        <w:tc>
+          <w:tcPr>
+            <w:tcW w:w="6917" w:type="dxa"/>
+            <w:vAlign w:val="center"/>
+          </w:tcPr>
+          <w:p>
+            <w:pPr>
+              <w:spacing w:after="0" w:line="240" w:lineRule="auto"/>
+            </w:pPr>
+            <w:r>
+              <w:rPr>
+                <w:rFonts w:ascii="Times New Roman" w:hAnsi="Times New Roman" w:eastAsia="Times New Roman"/>
+                <w:sz w:val="22"/>
+              </w:rPr>
+              <w:t>{{name}}</w:t>
+            </w:r>
+          </w:p>
+        </w:tc>
+        <w:tc>
+          <w:tcPr>
+            <w:tcW w:w="1984" w:type="dxa"/>
+            <w:vAlign w:val="center"/>
+          </w:tcPr>
+          <w:p>
+            <w:pPr>
+              <w:spacing w:after="0" w:line="240" w:lineRule="auto"/>
+              <w:jc w:val="right"/>
+            </w:pPr>
+            <w:r>
+              <w:rPr>
+                <w:rFonts w:ascii="Times New Roman" w:hAnsi="Times New Roman" w:eastAsia="Times New Roman"/>
+                <w:sz w:val="22"/>
+              </w:rPr>
+              <w:t>{{amount}}{{/estimate_works}}</w:t>
+            </w:r>
+          </w:p>
+        </w:tc>
+      </w:tr>
+    </w:tbl>
+    <w:p>
+      <w:pPr>
+        <w:spacing w:after="80"/>
+      </w:pPr>
+    </w:p>
+    <w:tbl>
+      <w:tblPr>
+        <w:tblStyle w:val="4"/>
+        <w:tblW w:w="0" w:type="auto"/>
+        <w:jc w:val="right"/>
+        <w:tblBorders>
+          <w:top w:val="single" w:color="auto" w:sz="4" w:space="0"/>
+          <w:left w:val="single" w:color="auto" w:sz="4" w:space="0"/>
+          <w:bottom w:val="single" w:color="auto" w:sz="4" w:space="0"/>
+          <w:right w:val="single" w:color="auto" w:sz="4" w:space="0"/>
+          <w:insideH w:val="single" w:color="auto" w:sz="4" w:space="0"/>
+          <w:insideV w:val="single" w:color="auto" w:sz="4" w:space="0"/>
+        </w:tblBorders>
+        <w:tblLayout w:type="autofit"/>
+        <w:tblCellMar>
+          <w:top w:w="0" w:type="dxa"/>
+          <w:left w:w="108" w:type="dxa"/>
+          <w:bottom w:w="0" w:type="dxa"/>
+          <w:right w:w="108" w:type="dxa"/>
+        </w:tblCellMar>
+      </w:tblPr>
+      <w:tblGrid>
+        <w:gridCol w:w="2268"/>
+        <w:gridCol w:w="2835"/>
+      </w:tblGrid>
+      <w:tr>
+        <w:tblPrEx>
+          <w:tblBorders>
+            <w:top w:val="single" w:color="auto" w:sz="4" w:space="0"/>
+            <w:left w:val="single" w:color="auto" w:sz="4" w:space="0"/>
+            <w:bottom w:val="single" w:color="auto" w:sz="4" w:space="0"/>
+            <w:right w:val="single" w:color="auto" w:sz="4" w:space="0"/>
+            <w:insideH w:val="single" w:color="auto" w:sz="4" w:space="0"/>
+            <w:insideV w:val="single" w:color="auto" w:sz="4" w:space="0"/>
+          </w:tblBorders>
+          <w:tblCellMar>
+            <w:top w:w="0" w:type="dxa"/>
+            <w:left w:w="108" w:type="dxa"/>
+            <w:bottom w:w="0" w:type="dxa"/>
+            <w:right w:w="108" w:type="dxa"/>
+          </w:tblCellMar>
+        </w:tblPrEx>
+        <w:trPr>
+          <w:jc w:val="right"/>
+        </w:trPr>
+        <w:tc>
+          <w:tcPr>
+            <w:tcW w:w="2268" w:type="dxa"/>
+          </w:tcPr>
+          <w:p>
+            <w:pPr>
+              <w:spacing w:after="0" w:line="240" w:lineRule="auto"/>
+              <w:jc w:val="right"/>
+            </w:pPr>
+            <w:r>
+              <w:rPr>
+                <w:rFonts w:ascii="Times New Roman" w:hAnsi="Times New Roman" w:eastAsia="Times New Roman"/>
+                <w:sz w:val="22"/>
+              </w:rPr>
+              <w:t>ИТОГО:</w:t>
+            </w:r>
+          </w:p>
+        </w:tc>
+        <w:tc>
+          <w:tcPr>
+            <w:tcW w:w="2835" w:type="dxa"/>
+          </w:tcPr>
+          <w:p>
+            <w:pPr>
+              <w:spacing w:after="0" w:line="240" w:lineRule="auto"/>
+              <w:jc w:val="right"/>
+            </w:pPr>
+            <w:r>
+              <w:rPr>
+                <w:rFonts w:ascii="Times New Roman" w:hAnsi="Times New Roman" w:eastAsia="Times New Roman"/>
+                <w:sz w:val="22"/>
+              </w:rPr>
+              <w:t>{{estimate_total_amount}} рублей</w:t>
+            </w:r>
+          </w:p>
+        </w:tc>
+      </w:tr>
+      <w:tr>
+        <w:tblPrEx>
+          <w:tblBorders>
+            <w:top w:val="single" w:color="auto" w:sz="4" w:space="0"/>
+            <w:left w:val="single" w:color="auto" w:sz="4" w:space="0"/>
+            <w:bottom w:val="single" w:color="auto" w:sz="4" w:space="0"/>
+            <w:right w:val="single" w:color="auto" w:sz="4" w:space="0"/>
+            <w:insideH w:val="single" w:color="auto" w:sz="4" w:space="0"/>
+            <w:insideV w:val="single" w:color="auto" w:sz="4" w:space="0"/>
+          </w:tblBorders>
+          <w:tblCellMar>
+            <w:top w:w="0" w:type="dxa"/>
+            <w:left w:w="108" w:type="dxa"/>
+            <w:bottom w:w="0" w:type="dxa"/>
+            <w:right w:w="108" w:type="dxa"/>
+          </w:tblCellMar>
+        </w:tblPrEx>
+        <w:trPr>
+          <w:jc w:val="right"/>
+        </w:trPr>
+        <w:tc>
+          <w:tcPr>
+            <w:tcW w:w="2268" w:type="dxa"/>
+          </w:tcPr>
+          <w:p>
+            <w:pPr>
+              <w:spacing w:after="0" w:line="240" w:lineRule="auto"/>
+              <w:jc w:val="right"/>
+            </w:pPr>
+            <w:r>
+              <w:rPr>
+                <w:rFonts w:ascii="Times New Roman" w:hAnsi="Times New Roman" w:eastAsia="Times New Roman"/>
+                <w:sz w:val="22"/>
+              </w:rPr>
+              <w:t>Всего часов:</w:t>
+            </w:r>
+          </w:p>
+        </w:tc>
+        <w:tc>
+          <w:tcPr>
+            <w:tcW w:w="2835" w:type="dxa"/>
+          </w:tcPr>
+          <w:p>
+            <w:pPr>
+              <w:spacing w:after="0" w:line="240" w:lineRule="auto"/>
+              <w:jc w:val="right"/>
+            </w:pPr>
+            <w:r>
+              <w:rPr>
+                <w:rFonts w:ascii="Times New Roman" w:hAnsi="Times New Roman" w:eastAsia="Times New Roman"/>
+                <w:sz w:val="22"/>
+              </w:rPr>
+              <w:t>{{estimate_total_hours}}</w:t>
+            </w:r>
+          </w:p>
+        </w:tc>
+      </w:tr>
+    </w:tbl>
+    <w:p/>
+    <w:p>
+      <w:pPr>
+        <w:spacing w:after="80"/>
+      </w:pPr>
+      <w:r>
+        <w:rPr>
+          <w:rFonts w:ascii="Times New Roman" w:hAnsi="Times New Roman" w:eastAsia="Times New Roman"/>
+          <w:b/>
+          <w:sz w:val="22"/>
+        </w:rPr>
+        <w:t>Тестовые плейсхолдеры для проверки:</w:t>
+      </w:r>
+    </w:p>
+    <w:p>
+      <w:pPr>
+        <w:spacing w:after="80"/>
+      </w:pPr>
+      <w:r>
+        <w:rPr>
+          <w:rFonts w:ascii="Times New Roman" w:hAnsi="Times New Roman" w:eastAsia="Times New Roman"/>
+          <w:b w:val="0"/>
+          <w:sz w:val="20"/>
+        </w:rPr>
+        <w:t>{{#estimate_works}}{{index}} / {{name}} / {{amount}}{{/estimate_works}}</w:t>
       </w:r>
     </w:p>
     <w:p>
@@ -21,105 +681,12 @@
           <w:rFonts w:hint="default"/>
         </w:rPr>
       </w:pPr>
-    </w:p>
-    <w:p>
-      <w:pPr>
-        <w:rPr>
-          <w:rFonts w:hint="default"/>
-        </w:rPr>
-      </w:pPr>
-      <w:r>
-        <w:rPr>
-          <w:rFonts w:hint="default"/>
-        </w:rPr>
-        <w:t>Дата: {{contract_date_text}}</w:t>
-      </w:r>
-    </w:p>
-    <w:p>
-      <w:pPr>
-        <w:rPr>
-          <w:rFonts w:hint="default"/>
-        </w:rPr>
-      </w:pPr>
-    </w:p>
-    <w:p>
-      <w:pPr>
-        <w:rPr>
-          <w:rFonts w:hint="default"/>
-        </w:rPr>
-      </w:pPr>
-      <w:r>
-        <w:rPr>
-          <w:rFonts w:hint="default"/>
-        </w:rPr>
-        <w:t>Заказчик: {{client_name}}</w:t>
-      </w:r>
-    </w:p>
-    <w:p>
-      <w:pPr>
-        <w:rPr>
-          <w:rFonts w:hint="default"/>
-        </w:rPr>
-      </w:pPr>
-    </w:p>
-    <w:p>
-      <w:pPr>
-        <w:rPr>
-          <w:rFonts w:hint="default"/>
-        </w:rPr>
-      </w:pPr>
-      <w:r>
-        <w:rPr>
-          <w:rFonts w:hint="default"/>
-        </w:rPr>
-        <w:t>Сумма: {{amount_number}} рублей</w:t>
-      </w:r>
-    </w:p>
-    <w:p>
-      <w:pPr>
-        <w:rPr>
-          <w:rFonts w:hint="default"/>
-        </w:rPr>
-      </w:pPr>
-    </w:p>
-    <w:p>
-      <w:pPr>
-        <w:rPr>
-          <w:rFonts w:hint="default"/>
-        </w:rPr>
-      </w:pPr>
-      <w:r>
-        <w:rPr>
-          <w:rFonts w:hint="default"/>
-        </w:rPr>
-        <w:t>Предоплата: {{prepayment_amount}} рублей</w:t>
-      </w:r>
-    </w:p>
-    <w:p>
-      <w:pPr>
-        <w:rPr>
-          <w:rFonts w:hint="default"/>
-        </w:rPr>
-      </w:pPr>
-    </w:p>
-    <w:p>
-      <w:pPr>
-        <w:rPr>
-          <w:rFonts w:hint="default"/>
-        </w:rPr>
-      </w:pPr>
-      <w:r>
-        <w:rPr>
-          <w:rFonts w:hint="default"/>
-        </w:rPr>
-        <w:t>Постоплата: {{postpayment_amount}} рублей</w:t>
-      </w:r>
       <w:bookmarkStart w:id="0" w:name="_GoBack"/>
       <w:bookmarkEnd w:id="0"/>
     </w:p>
     <w:sectPr>
-      <w:pgSz w:w="11906" w:h="16838"/>
-      <w:pgMar w:top="1440" w:right="1800" w:bottom="1440" w:left="1800" w:header="720" w:footer="720" w:gutter="0"/>
+      <w:pgSz w:w="12240" w:h="15840"/>
+      <w:pgMar w:top="1134" w:right="1134" w:bottom="1134" w:left="1134" w:header="720" w:footer="720" w:gutter="0"/>
       <w:cols w:space="720" w:num="1"/>
       <w:docGrid w:linePitch="360" w:charSpace="0"/>
     </w:sectPr>
@@ -127,12 +694,62 @@
 </w:document>
 </file>
 
+<file path=word/endnotes.xml><?xml version="1.0" encoding="utf-8"?>
+<w:endnotes xmlns:wpc="http://schemas.microsoft.com/office/word/2010/wordprocessingCanvas" xmlns:mc="http://schemas.openxmlformats.org/markup-compatibility/2006" xmlns:o="urn:schemas-microsoft-com:office:office" xmlns:r="http://schemas.openxmlformats.org/officeDocument/2006/relationships" xmlns:m="http://schemas.openxmlformats.org/officeDocument/2006/math" xmlns:v="urn:schemas-microsoft-com:vml" xmlns:wp14="http://schemas.microsoft.com/office/word/2010/wordprocessingDrawing" xmlns:wp="http://schemas.openxmlformats.org/drawingml/2006/wordprocessingDrawing" xmlns:w="http://schemas.openxmlformats.org/wordprocessingml/2006/main" xmlns:w14="http://schemas.microsoft.com/office/word/2010/wordml" xmlns:w15="http://schemas.microsoft.com/office/word/2012/wordml" xmlns:w10="urn:schemas-microsoft-com:office:word" xmlns:wpg="http://schemas.microsoft.com/office/word/2010/wordprocessingGroup" xmlns:wpi="http://schemas.microsoft.com/office/word/2010/wordprocessingInk" xmlns:wne="http://schemas.microsoft.com/office/word/2006/wordml" xmlns:wps="http://schemas.microsoft.com/office/word/2010/wordprocessingShape" xmlns:wpsCustomData="http://www.wps.cn/officeDocument/2013/wpsCustomData" mc:Ignorable="w14 w15 wp14">
+  <w:endnote w:type="separator" w:id="0">
+    <w:p>
+      <w:pPr>
+        <w:spacing w:line="240" w:lineRule="auto"/>
+      </w:pPr>
+      <w:r>
+        <w:separator/>
+      </w:r>
+    </w:p>
+  </w:endnote>
+  <w:endnote w:type="continuationSeparator" w:id="1">
+    <w:p>
+      <w:pPr>
+        <w:spacing w:line="240" w:lineRule="auto"/>
+      </w:pPr>
+      <w:r>
+        <w:continuationSeparator/>
+      </w:r>
+    </w:p>
+  </w:endnote>
+</w:endnotes>
+</file>
+
+<file path=word/footnotes.xml><?xml version="1.0" encoding="utf-8"?>
+<w:footnotes xmlns:wpc="http://schemas.microsoft.com/office/word/2010/wordprocessingCanvas" xmlns:mc="http://schemas.openxmlformats.org/markup-compatibility/2006" xmlns:o="urn:schemas-microsoft-com:office:office" xmlns:r="http://schemas.openxmlformats.org/officeDocument/2006/relationships" xmlns:m="http://schemas.openxmlformats.org/officeDocument/2006/math" xmlns:v="urn:schemas-microsoft-com:vml" xmlns:wp14="http://schemas.microsoft.com/office/word/2010/wordprocessingDrawing" xmlns:wp="http://schemas.openxmlformats.org/drawingml/2006/wordprocessingDrawing" xmlns:w="http://schemas.openxmlformats.org/wordprocessingml/2006/main" xmlns:w14="http://schemas.microsoft.com/office/word/2010/wordml" xmlns:w15="http://schemas.microsoft.com/office/word/2012/wordml" xmlns:w10="urn:schemas-microsoft-com:office:word" xmlns:wpg="http://schemas.microsoft.com/office/word/2010/wordprocessingGroup" xmlns:wpi="http://schemas.microsoft.com/office/word/2010/wordprocessingInk" xmlns:wne="http://schemas.microsoft.com/office/word/2006/wordml" xmlns:wps="http://schemas.microsoft.com/office/word/2010/wordprocessingShape" xmlns:wpsCustomData="http://www.wps.cn/officeDocument/2013/wpsCustomData" mc:Ignorable="w14 w15 wp14">
+  <w:footnote w:type="separator" w:id="0">
+    <w:p>
+      <w:pPr>
+        <w:spacing w:before="0" w:after="0" w:line="276" w:lineRule="auto"/>
+      </w:pPr>
+      <w:r>
+        <w:separator/>
+      </w:r>
+    </w:p>
+  </w:footnote>
+  <w:footnote w:type="continuationSeparator" w:id="1">
+    <w:p>
+      <w:pPr>
+        <w:spacing w:before="0" w:after="0" w:line="276" w:lineRule="auto"/>
+      </w:pPr>
+      <w:r>
+        <w:continuationSeparator/>
+      </w:r>
+    </w:p>
+  </w:footnote>
+</w:footnotes>
+</file>
+
 <file path=word/styles.xml><?xml version="1.0" encoding="utf-8"?>
 <w:styles xmlns:mc="http://schemas.openxmlformats.org/markup-compatibility/2006" xmlns:o="urn:schemas-microsoft-com:office:office" xmlns:r="http://schemas.openxmlformats.org/officeDocument/2006/relationships" xmlns:m="http://schemas.openxmlformats.org/officeDocument/2006/math" xmlns:v="urn:schemas-microsoft-com:vml" xmlns:w="http://schemas.openxmlformats.org/wordprocessingml/2006/main" xmlns:w14="http://schemas.microsoft.com/office/word/2010/wordml" xmlns:w10="urn:schemas-microsoft-com:office:word" xmlns:sl="http://schemas.openxmlformats.org/schemaLibrary/2006/main" xmlns:wpsCustomData="http://www.wps.cn/officeDocument/2013/wpsCustomData" mc:Ignorable="w14">
   <w:docDefaults>
     <w:rPrDefault>
       <w:rPr>
-        <w:rFonts w:asciiTheme="minorHAnsi" w:hAnsiTheme="minorHAnsi" w:eastAsiaTheme="minorEastAsia" w:cstheme="minorBidi"/>
+        <w:rFonts w:ascii="Times New Roman" w:hAnsi="Times New Roman" w:eastAsia="SimSun" w:cs="Times New Roman"/>
       </w:rPr>
     </w:rPrDefault>
     <w:pPrDefault/>
@@ -286,16 +903,21 @@
     <w:lsdException w:unhideWhenUsed="0" w:uiPriority="0" w:semiHidden="0" w:name="Table Web 2"/>
     <w:lsdException w:unhideWhenUsed="0" w:uiPriority="0" w:semiHidden="0" w:name="Table Web 3"/>
     <w:lsdException w:unhideWhenUsed="0" w:uiPriority="0" w:semiHidden="0" w:name="Balloon Text"/>
-    <w:lsdException w:unhideWhenUsed="0" w:uiPriority="0" w:semiHidden="0" w:name="Table Grid"/>
+    <w:lsdException w:qFormat="1" w:unhideWhenUsed="0" w:uiPriority="59" w:semiHidden="0" w:name="Table Grid"/>
     <w:lsdException w:unhideWhenUsed="0" w:uiPriority="0" w:semiHidden="0" w:name="Table Theme"/>
   </w:latentStyles>
   <w:style w:type="paragraph" w:default="1" w:styleId="1">
     <w:name w:val="Normal"/>
     <w:qFormat/>
     <w:uiPriority w:val="0"/>
+    <w:pPr>
+      <w:spacing w:after="200" w:line="276" w:lineRule="auto"/>
+    </w:pPr>
     <w:rPr>
-      <w:rFonts w:asciiTheme="minorHAnsi" w:hAnsiTheme="minorHAnsi" w:eastAsiaTheme="minorEastAsia" w:cstheme="minorBidi"/>
-      <w:lang w:val="en-US" w:eastAsia="zh-CN" w:bidi="ar-SA"/>
+      <w:rFonts w:ascii="Times New Roman" w:hAnsi="Times New Roman" w:eastAsia="Times New Roman" w:cstheme="minorBidi"/>
+      <w:sz w:val="22"/>
+      <w:szCs w:val="22"/>
+      <w:lang w:val="en-US" w:eastAsia="en-US" w:bidi="ar-SA"/>
     </w:rPr>
   </w:style>
   <w:style w:type="character" w:default="1" w:styleId="2">
@@ -310,6 +932,31 @@
     <w:qFormat/>
     <w:uiPriority w:val="0"/>
     <w:tblPr>
+      <w:tblCellMar>
+        <w:top w:w="0" w:type="dxa"/>
+        <w:left w:w="108" w:type="dxa"/>
+        <w:bottom w:w="0" w:type="dxa"/>
+        <w:right w:w="108" w:type="dxa"/>
+      </w:tblCellMar>
+    </w:tblPr>
+  </w:style>
+  <w:style w:type="table" w:styleId="4">
+    <w:name w:val="Table Grid"/>
+    <w:basedOn w:val="3"/>
+    <w:qFormat/>
+    <w:uiPriority w:val="59"/>
+    <w:pPr>
+      <w:spacing w:after="0" w:line="240" w:lineRule="auto"/>
+    </w:pPr>
+    <w:tblPr>
+      <w:tblBorders>
+        <w:top w:val="single" w:color="auto" w:sz="4" w:space="0"/>
+        <w:left w:val="single" w:color="auto" w:sz="4" w:space="0"/>
+        <w:bottom w:val="single" w:color="auto" w:sz="4" w:space="0"/>
+        <w:right w:val="single" w:color="auto" w:sz="4" w:space="0"/>
+        <w:insideH w:val="single" w:color="auto" w:sz="4" w:space="0"/>
+        <w:insideV w:val="single" w:color="auto" w:sz="4" w:space="0"/>
+      </w:tblBorders>
       <w:tblCellMar>
         <w:top w:w="0" w:type="dxa"/>
         <w:left w:w="108" w:type="dxa"/>

</xml_diff>